<commit_message>
modyfikacja opisu i polecenia sql
</commit_message>
<xml_diff>
--- a/Opis słowny projektu Schronisko dla zwierząt.docx
+++ b/Opis słowny projektu Schronisko dla zwierząt.docx
@@ -110,31 +110,25 @@
         <w:t>Zwierzaki</w:t>
       </w:r>
       <w:r>
-        <w:t xml:space="preserve"> (id, imię, rasa, wiek, płeć, status, </w:t>
-      </w:r>
-      <w:proofErr w:type="spellStart"/>
-      <w:r>
-        <w:t>opiekun_id</w:t>
-      </w:r>
-      <w:proofErr w:type="spellEnd"/>
-      <w:r>
-        <w:t xml:space="preserve">, </w:t>
-      </w:r>
-      <w:proofErr w:type="spellStart"/>
+        <w:t xml:space="preserve"> (</w:t>
+      </w:r>
+      <w:r>
+        <w:t>zwierze_id</w:t>
+      </w:r>
+      <w:r>
+        <w:t>, imię,</w:t>
+      </w:r>
+      <w:r>
+        <w:t xml:space="preserve"> rodzaj, </w:t>
+      </w:r>
+      <w:r>
+        <w:t xml:space="preserve"> rasa, wiek, płeć, status, opiekun_id, </w:t>
+      </w:r>
       <w:r>
         <w:t>numer_kojca</w:t>
       </w:r>
-      <w:proofErr w:type="spellEnd"/>
-      <w:r>
-        <w:t xml:space="preserve">, </w:t>
-      </w:r>
-      <w:proofErr w:type="spellStart"/>
-      <w:r>
-        <w:t>data_przyjęcia</w:t>
-      </w:r>
-      <w:proofErr w:type="spellEnd"/>
-      <w:r>
-        <w:t>) </w:t>
+      <w:r>
+        <w:t>, data_przyjęcia) </w:t>
       </w:r>
     </w:p>
     <w:p>
@@ -155,6 +149,9 @@
         <w:t xml:space="preserve"> (</w:t>
       </w:r>
       <w:r>
+        <w:t>kojec_</w:t>
+      </w:r>
+      <w:r>
         <w:t xml:space="preserve">id, </w:t>
       </w:r>
       <w:r>
@@ -176,23 +173,13 @@
         <w:t>Pracownicy</w:t>
       </w:r>
       <w:r>
-        <w:t xml:space="preserve"> (id, imię, nazwisko, pensja, stanowisko, adres, </w:t>
-      </w:r>
-      <w:proofErr w:type="spellStart"/>
-      <w:r>
-        <w:t>data_zatrudnienia</w:t>
-      </w:r>
-      <w:proofErr w:type="spellEnd"/>
-      <w:r>
-        <w:t xml:space="preserve">, </w:t>
-      </w:r>
-      <w:proofErr w:type="spellStart"/>
-      <w:r>
-        <w:t>data_zakończenia</w:t>
-      </w:r>
-      <w:proofErr w:type="spellEnd"/>
-      <w:r>
-        <w:t>) </w:t>
+        <w:t xml:space="preserve"> (</w:t>
+      </w:r>
+      <w:r>
+        <w:t>pracownik_id</w:t>
+      </w:r>
+      <w:r>
+        <w:t>, imię, nazwisko, pensja, stanowisko, adres, data_zatrudnienia, data_zakończenia) </w:t>
       </w:r>
     </w:p>
     <w:p>
@@ -212,46 +199,18 @@
       <w:r>
         <w:t xml:space="preserve"> (</w:t>
       </w:r>
-      <w:proofErr w:type="spellStart"/>
-      <w:r>
-        <w:t>id_adopcji</w:t>
-      </w:r>
-      <w:proofErr w:type="spellEnd"/>
-      <w:r>
-        <w:t xml:space="preserve">, </w:t>
-      </w:r>
-      <w:proofErr w:type="spellStart"/>
-      <w:r>
-        <w:t>data_adopcji</w:t>
-      </w:r>
-      <w:proofErr w:type="spellEnd"/>
-      <w:r>
-        <w:t xml:space="preserve">, </w:t>
-      </w:r>
-      <w:proofErr w:type="spellStart"/>
-      <w:r>
-        <w:t>osoba_adoptujaca_id</w:t>
-      </w:r>
-      <w:proofErr w:type="spellEnd"/>
-      <w:r>
-        <w:t xml:space="preserve">, </w:t>
-      </w:r>
-      <w:proofErr w:type="spellStart"/>
-      <w:r>
-        <w:t>zwierzak_id</w:t>
-      </w:r>
-      <w:proofErr w:type="spellEnd"/>
-      <w:r>
-        <w:t xml:space="preserve">, </w:t>
-      </w:r>
-      <w:proofErr w:type="spellStart"/>
+      <w:r>
+        <w:t>adopcja_id</w:t>
+      </w:r>
+      <w:r>
+        <w:t xml:space="preserve">, data_adopcji, osoba_adoptujaca_id, zwierzak_id, </w:t>
+      </w:r>
       <w:r>
         <w:rPr>
           <w:u w:val="single"/>
         </w:rPr>
         <w:t>pracownik_id</w:t>
       </w:r>
-      <w:proofErr w:type="spellEnd"/>
       <w:r>
         <w:t>) </w:t>
       </w:r>
@@ -271,7 +230,13 @@
         <w:t>Osoby adoptujące</w:t>
       </w:r>
       <w:r>
-        <w:t xml:space="preserve"> (id, imię, nazwisko, adres, </w:t>
+        <w:t xml:space="preserve"> (</w:t>
+      </w:r>
+      <w:r>
+        <w:t>adopter_id</w:t>
+      </w:r>
+      <w:r>
+        <w:t xml:space="preserve">, imię, nazwisko, adres, </w:t>
       </w:r>
       <w:r>
         <w:t>telefon</w:t>
@@ -295,15 +260,13 @@
         <w:t>Rejestr darowizn</w:t>
       </w:r>
       <w:r>
-        <w:t xml:space="preserve"> (id, </w:t>
-      </w:r>
-      <w:proofErr w:type="spellStart"/>
-      <w:r>
-        <w:t>darczyńca_id</w:t>
-      </w:r>
-      <w:proofErr w:type="spellEnd"/>
-      <w:r>
-        <w:t>, kwota, , data) </w:t>
+        <w:t xml:space="preserve"> (</w:t>
+      </w:r>
+      <w:r>
+        <w:t>darowizna_id</w:t>
+      </w:r>
+      <w:r>
+        <w:t>, darczyńca_id, kwota , data) </w:t>
       </w:r>
     </w:p>
     <w:p>
@@ -321,7 +284,13 @@
         <w:t>Osoby darczyńcy</w:t>
       </w:r>
       <w:r>
-        <w:t xml:space="preserve"> (id, </w:t>
+        <w:t xml:space="preserve"> (</w:t>
+      </w:r>
+      <w:r>
+        <w:t>darczynca_id</w:t>
+      </w:r>
+      <w:r>
+        <w:t xml:space="preserve">, </w:t>
       </w:r>
       <w:r>
         <w:t xml:space="preserve">nazwa użytkownika,  </w:t>

</xml_diff>